<commit_message>
client name and partner name
</commit_message>
<xml_diff>
--- a/public/assets/template2.docx
+++ b/public/assets/template2.docx
@@ -10585,7 +10585,14 @@
                 <w:rFonts w:ascii="Segoe UI Light" w:hAnsi="Segoe UI Light" w:cs="Segoe UI Light"/>
                 <w:bCs/>
               </w:rPr>
-              <w:t>clientPreferred</w:t>
+              <w:t>partner</w:t>
+            </w:r>
+            <w:r>
+              <w:rPr>
+                <w:rFonts w:ascii="Segoe UI Light" w:hAnsi="Segoe UI Light" w:cs="Segoe UI Light"/>
+                <w:bCs/>
+              </w:rPr>
+              <w:t>Preferred</w:t>
             </w:r>
             <w:proofErr w:type="spellEnd"/>
             <w:r>
@@ -10656,13 +10663,7 @@
               <w:rPr>
                 <w:rFonts w:ascii="Segoe UI Light" w:hAnsi="Segoe UI Light" w:cs="Segoe UI Light"/>
               </w:rPr>
-              <w:t>client</w:t>
-            </w:r>
-            <w:r>
-              <w:rPr>
-                <w:rFonts w:ascii="Segoe UI Light" w:hAnsi="Segoe UI Light" w:cs="Segoe UI Light"/>
-              </w:rPr>
-              <w:t>D</w:t>
+              <w:t>partnerD</w:t>
             </w:r>
             <w:r>
               <w:rPr>
@@ -10790,13 +10791,7 @@
               <w:rPr>
                 <w:rFonts w:ascii="Segoe UI Light" w:hAnsi="Segoe UI Light" w:cs="Segoe UI Light"/>
               </w:rPr>
-              <w:t>client</w:t>
-            </w:r>
-            <w:r>
-              <w:rPr>
-                <w:rFonts w:ascii="Segoe UI Light" w:hAnsi="Segoe UI Light" w:cs="Segoe UI Light"/>
-              </w:rPr>
-              <w:t>H</w:t>
+              <w:t>partnerH</w:t>
             </w:r>
             <w:r>
               <w:rPr>
@@ -10853,13 +10848,7 @@
               <w:rPr>
                 <w:rFonts w:ascii="Segoe UI Light" w:hAnsi="Segoe UI Light" w:cs="Segoe UI Light"/>
               </w:rPr>
-              <w:t>client</w:t>
-            </w:r>
-            <w:r>
-              <w:rPr>
-                <w:rFonts w:ascii="Segoe UI Light" w:hAnsi="Segoe UI Light" w:cs="Segoe UI Light"/>
-              </w:rPr>
-              <w:t>M</w:t>
+              <w:t>partnerM</w:t>
             </w:r>
             <w:r>
               <w:rPr>
@@ -11571,7 +11560,14 @@
                 <w:rFonts w:ascii="Segoe UI Light" w:hAnsi="Segoe UI Light" w:cs="Segoe UI Light"/>
                 <w:b/>
               </w:rPr>
-              <w:t>clientPreferred</w:t>
+              <w:t>partner</w:t>
+            </w:r>
+            <w:r>
+              <w:rPr>
+                <w:rFonts w:ascii="Segoe UI Light" w:hAnsi="Segoe UI Light" w:cs="Segoe UI Light"/>
+                <w:b/>
+              </w:rPr>
+              <w:t>Preferred</w:t>
             </w:r>
             <w:proofErr w:type="spellEnd"/>
             <w:r>
@@ -12611,7 +12607,14 @@
                 <w:rFonts w:ascii="Segoe UI Light" w:hAnsi="Segoe UI Light" w:cs="Segoe UI Light"/>
                 <w:bCs/>
               </w:rPr>
-              <w:t>clientPreferred</w:t>
+              <w:t>partner</w:t>
+            </w:r>
+            <w:r>
+              <w:rPr>
+                <w:rFonts w:ascii="Segoe UI Light" w:hAnsi="Segoe UI Light" w:cs="Segoe UI Light"/>
+                <w:bCs/>
+              </w:rPr>
+              <w:t>Preferred</w:t>
             </w:r>
             <w:proofErr w:type="spellEnd"/>
             <w:r>
@@ -12654,7 +12657,7 @@
         </w:tc>
         <w:tc>
           <w:tcPr>
-            <w:tcW w:w="1667" w:type="pct"/>
+            <w:tcW w:w="1666" w:type="pct"/>
             <w:tcBorders>
               <w:top w:val="single" w:sz="4" w:space="0" w:color="auto"/>
               <w:left w:val="single" w:sz="4" w:space="0" w:color="auto"/>
@@ -12682,13 +12685,7 @@
               <w:rPr>
                 <w:rFonts w:ascii="Segoe UI Light" w:hAnsi="Segoe UI Light" w:cs="Segoe UI Light"/>
               </w:rPr>
-              <w:t>client</w:t>
-            </w:r>
-            <w:r>
-              <w:rPr>
-                <w:rFonts w:ascii="Segoe UI Light" w:hAnsi="Segoe UI Light" w:cs="Segoe UI Light"/>
-              </w:rPr>
-              <w:t>D</w:t>
+              <w:t>partnerD</w:t>
             </w:r>
             <w:r>
               <w:rPr>
@@ -12816,13 +12813,7 @@
               <w:rPr>
                 <w:rFonts w:ascii="Segoe UI Light" w:hAnsi="Segoe UI Light" w:cs="Segoe UI Light"/>
               </w:rPr>
-              <w:t>client</w:t>
-            </w:r>
-            <w:r>
-              <w:rPr>
-                <w:rFonts w:ascii="Segoe UI Light" w:hAnsi="Segoe UI Light" w:cs="Segoe UI Light"/>
-              </w:rPr>
-              <w:t>H</w:t>
+              <w:t>partnerH</w:t>
             </w:r>
             <w:r>
               <w:rPr>
@@ -12879,13 +12870,7 @@
               <w:rPr>
                 <w:rFonts w:ascii="Segoe UI Light" w:hAnsi="Segoe UI Light" w:cs="Segoe UI Light"/>
               </w:rPr>
-              <w:t>client</w:t>
-            </w:r>
-            <w:r>
-              <w:rPr>
-                <w:rFonts w:ascii="Segoe UI Light" w:hAnsi="Segoe UI Light" w:cs="Segoe UI Light"/>
-              </w:rPr>
-              <w:t>M</w:t>
+              <w:t>partnerM</w:t>
             </w:r>
             <w:r>
               <w:rPr>
@@ -12934,7 +12919,7 @@
         </w:tc>
         <w:tc>
           <w:tcPr>
-            <w:tcW w:w="1667" w:type="pct"/>
+            <w:tcW w:w="1666" w:type="pct"/>
             <w:tcBorders>
               <w:top w:val="single" w:sz="4" w:space="0" w:color="auto"/>
               <w:left w:val="single" w:sz="4" w:space="0" w:color="auto"/>
@@ -13597,7 +13582,14 @@
                 <w:rFonts w:ascii="Segoe UI Light" w:hAnsi="Segoe UI Light" w:cs="Segoe UI Light"/>
                 <w:b/>
               </w:rPr>
-              <w:t>clientPreferred</w:t>
+              <w:t>partner</w:t>
+            </w:r>
+            <w:r>
+              <w:rPr>
+                <w:rFonts w:ascii="Segoe UI Light" w:hAnsi="Segoe UI Light" w:cs="Segoe UI Light"/>
+                <w:b/>
+              </w:rPr>
+              <w:t>Preferred</w:t>
             </w:r>
             <w:proofErr w:type="spellEnd"/>
             <w:r>
@@ -14644,7 +14636,14 @@
                 <w:rFonts w:ascii="Segoe UI Light" w:hAnsi="Segoe UI Light" w:cs="Segoe UI Light"/>
                 <w:bCs/>
               </w:rPr>
-              <w:t>clientPreferred</w:t>
+              <w:t>partner</w:t>
+            </w:r>
+            <w:r>
+              <w:rPr>
+                <w:rFonts w:ascii="Segoe UI Light" w:hAnsi="Segoe UI Light" w:cs="Segoe UI Light"/>
+                <w:bCs/>
+              </w:rPr>
+              <w:t>Preferred</w:t>
             </w:r>
             <w:proofErr w:type="spellEnd"/>
             <w:r>
@@ -14714,8 +14713,9 @@
             <w:r>
               <w:rPr>
                 <w:rFonts w:ascii="Segoe UI Light" w:hAnsi="Segoe UI Light" w:cs="Segoe UI Light"/>
-              </w:rPr>
-              <w:t>client</w:t>
+                <w:bCs/>
+              </w:rPr>
+              <w:t>partner</w:t>
             </w:r>
             <w:r>
               <w:rPr>
@@ -14848,8 +14848,9 @@
             <w:r>
               <w:rPr>
                 <w:rFonts w:ascii="Segoe UI Light" w:hAnsi="Segoe UI Light" w:cs="Segoe UI Light"/>
-              </w:rPr>
-              <w:t>client</w:t>
+                <w:bCs/>
+              </w:rPr>
+              <w:t>partner</w:t>
             </w:r>
             <w:r>
               <w:rPr>
@@ -14911,8 +14912,9 @@
             <w:r>
               <w:rPr>
                 <w:rFonts w:ascii="Segoe UI Light" w:hAnsi="Segoe UI Light" w:cs="Segoe UI Light"/>
-              </w:rPr>
-              <w:t>client</w:t>
+                <w:bCs/>
+              </w:rPr>
+              <w:t>partner</w:t>
             </w:r>
             <w:r>
               <w:rPr>
@@ -15629,7 +15631,14 @@
                 <w:rFonts w:ascii="Segoe UI Light" w:hAnsi="Segoe UI Light" w:cs="Segoe UI Light"/>
                 <w:b/>
               </w:rPr>
-              <w:t>clientPreferred</w:t>
+              <w:t>partner</w:t>
+            </w:r>
+            <w:r>
+              <w:rPr>
+                <w:rFonts w:ascii="Segoe UI Light" w:hAnsi="Segoe UI Light" w:cs="Segoe UI Light"/>
+                <w:b/>
+              </w:rPr>
+              <w:t>Preferred</w:t>
             </w:r>
             <w:proofErr w:type="spellEnd"/>
             <w:r>
@@ -16669,7 +16678,14 @@
                 <w:rFonts w:ascii="Segoe UI Light" w:hAnsi="Segoe UI Light" w:cs="Segoe UI Light"/>
                 <w:bCs/>
               </w:rPr>
-              <w:t>clientPreferred</w:t>
+              <w:t>partner</w:t>
+            </w:r>
+            <w:r>
+              <w:rPr>
+                <w:rFonts w:ascii="Segoe UI Light" w:hAnsi="Segoe UI Light" w:cs="Segoe UI Light"/>
+                <w:bCs/>
+              </w:rPr>
+              <w:t>Preferred</w:t>
             </w:r>
             <w:proofErr w:type="spellEnd"/>
             <w:r>
@@ -16739,8 +16755,9 @@
             <w:r>
               <w:rPr>
                 <w:rFonts w:ascii="Segoe UI Light" w:hAnsi="Segoe UI Light" w:cs="Segoe UI Light"/>
-              </w:rPr>
-              <w:t>client</w:t>
+                <w:bCs/>
+              </w:rPr>
+              <w:t>partner</w:t>
             </w:r>
             <w:r>
               <w:rPr>
@@ -16873,8 +16890,9 @@
             <w:r>
               <w:rPr>
                 <w:rFonts w:ascii="Segoe UI Light" w:hAnsi="Segoe UI Light" w:cs="Segoe UI Light"/>
-              </w:rPr>
-              <w:t>client</w:t>
+                <w:bCs/>
+              </w:rPr>
+              <w:t>partner</w:t>
             </w:r>
             <w:r>
               <w:rPr>
@@ -16936,8 +16954,9 @@
             <w:r>
               <w:rPr>
                 <w:rFonts w:ascii="Segoe UI Light" w:hAnsi="Segoe UI Light" w:cs="Segoe UI Light"/>
-              </w:rPr>
-              <w:t>client</w:t>
+                <w:bCs/>
+              </w:rPr>
+              <w:t>partner</w:t>
             </w:r>
             <w:r>
               <w:rPr>
@@ -17654,7 +17673,14 @@
                 <w:rFonts w:ascii="Segoe UI Light" w:hAnsi="Segoe UI Light" w:cs="Segoe UI Light"/>
                 <w:b/>
               </w:rPr>
-              <w:t>clientPreferred</w:t>
+              <w:t>partner</w:t>
+            </w:r>
+            <w:r>
+              <w:rPr>
+                <w:rFonts w:ascii="Segoe UI Light" w:hAnsi="Segoe UI Light" w:cs="Segoe UI Light"/>
+                <w:b/>
+              </w:rPr>
+              <w:t>Preferred</w:t>
             </w:r>
             <w:proofErr w:type="spellEnd"/>
             <w:r>
@@ -18688,7 +18714,14 @@
                 <w:rFonts w:ascii="Segoe UI Light" w:hAnsi="Segoe UI Light" w:cs="Segoe UI Light"/>
                 <w:bCs/>
               </w:rPr>
-              <w:t>clientPreferred</w:t>
+              <w:t>partner</w:t>
+            </w:r>
+            <w:r>
+              <w:rPr>
+                <w:rFonts w:ascii="Segoe UI Light" w:hAnsi="Segoe UI Light" w:cs="Segoe UI Light"/>
+                <w:bCs/>
+              </w:rPr>
+              <w:t>Preferred</w:t>
             </w:r>
             <w:proofErr w:type="spellEnd"/>
             <w:r>
@@ -18758,8 +18791,9 @@
             <w:r>
               <w:rPr>
                 <w:rFonts w:ascii="Segoe UI Light" w:hAnsi="Segoe UI Light" w:cs="Segoe UI Light"/>
-              </w:rPr>
-              <w:t>client</w:t>
+                <w:bCs/>
+              </w:rPr>
+              <w:t>partner</w:t>
             </w:r>
             <w:r>
               <w:rPr>
@@ -18892,8 +18926,9 @@
             <w:r>
               <w:rPr>
                 <w:rFonts w:ascii="Segoe UI Light" w:hAnsi="Segoe UI Light" w:cs="Segoe UI Light"/>
-              </w:rPr>
-              <w:t>client</w:t>
+                <w:bCs/>
+              </w:rPr>
+              <w:t>partner</w:t>
             </w:r>
             <w:r>
               <w:rPr>
@@ -18955,8 +18990,9 @@
             <w:r>
               <w:rPr>
                 <w:rFonts w:ascii="Segoe UI Light" w:hAnsi="Segoe UI Light" w:cs="Segoe UI Light"/>
-              </w:rPr>
-              <w:t>client</w:t>
+                <w:bCs/>
+              </w:rPr>
+              <w:t>partner</w:t>
             </w:r>
             <w:r>
               <w:rPr>
@@ -19673,7 +19709,14 @@
                 <w:rFonts w:ascii="Segoe UI Light" w:hAnsi="Segoe UI Light" w:cs="Segoe UI Light"/>
                 <w:b/>
               </w:rPr>
-              <w:t>clientPreferred</w:t>
+              <w:t>partner</w:t>
+            </w:r>
+            <w:r>
+              <w:rPr>
+                <w:rFonts w:ascii="Segoe UI Light" w:hAnsi="Segoe UI Light" w:cs="Segoe UI Light"/>
+                <w:b/>
+              </w:rPr>
+              <w:t>Preferred</w:t>
             </w:r>
             <w:proofErr w:type="spellEnd"/>
             <w:r>
@@ -20723,6 +20766,29 @@
               </w:rPr>
               <w:t>}}</w:t>
             </w:r>
+            <w:r>
+              <w:rPr>
+                <w:rFonts w:ascii="Segoe UI Light" w:hAnsi="Segoe UI Light" w:cs="Segoe UI Light"/>
+                <w:bCs/>
+              </w:rPr>
+              <w:t xml:space="preserve"> &amp; {{</w:t>
+            </w:r>
+            <w:proofErr w:type="spellStart"/>
+            <w:r>
+              <w:rPr>
+                <w:rFonts w:ascii="Segoe UI Light" w:hAnsi="Segoe UI Light" w:cs="Segoe UI Light"/>
+                <w:bCs/>
+              </w:rPr>
+              <w:t>partnerPreferred</w:t>
+            </w:r>
+            <w:proofErr w:type="spellEnd"/>
+            <w:r>
+              <w:rPr>
+                <w:rFonts w:ascii="Segoe UI Light" w:hAnsi="Segoe UI Light" w:cs="Segoe UI Light"/>
+                <w:bCs/>
+              </w:rPr>
+              <w:t>}}</w:t>
+            </w:r>
           </w:p>
         </w:tc>
         <w:tc>
@@ -20756,7 +20822,7 @@
         </w:tc>
         <w:tc>
           <w:tcPr>
-            <w:tcW w:w="1667" w:type="pct"/>
+            <w:tcW w:w="1666" w:type="pct"/>
             <w:tcBorders>
               <w:top w:val="single" w:sz="4" w:space="0" w:color="auto"/>
               <w:left w:val="single" w:sz="4" w:space="0" w:color="auto"/>
@@ -21036,7 +21102,7 @@
         </w:tc>
         <w:tc>
           <w:tcPr>
-            <w:tcW w:w="1667" w:type="pct"/>
+            <w:tcW w:w="1666" w:type="pct"/>
             <w:tcBorders>
               <w:top w:val="single" w:sz="4" w:space="0" w:color="auto"/>
               <w:left w:val="single" w:sz="4" w:space="0" w:color="auto"/>
@@ -21677,18 +21743,6 @@
             <w:r>
               <w:rPr>
                 <w:rFonts w:ascii="Segoe UI Light" w:hAnsi="Segoe UI Light" w:cs="Segoe UI Light"/>
-              </w:rPr>
-              <w:tab/>
-            </w:r>
-            <w:r>
-              <w:rPr>
-                <w:rFonts w:ascii="Segoe UI Light" w:hAnsi="Segoe UI Light" w:cs="Segoe UI Light"/>
-              </w:rPr>
-              <w:tab/>
-            </w:r>
-            <w:r>
-              <w:rPr>
-                <w:rFonts w:ascii="Segoe UI Light" w:hAnsi="Segoe UI Light" w:cs="Segoe UI Light"/>
                 <w:b/>
               </w:rPr>
               <w:t>{{</w:t>
@@ -21700,6 +21754,22 @@
                 <w:b/>
               </w:rPr>
               <w:t>clientPreferred</w:t>
+            </w:r>
+            <w:proofErr w:type="spellEnd"/>
+            <w:r>
+              <w:rPr>
+                <w:rFonts w:ascii="Segoe UI Light" w:hAnsi="Segoe UI Light" w:cs="Segoe UI Light"/>
+                <w:b/>
+              </w:rPr>
+              <w:t>}} &amp; {{</w:t>
+            </w:r>
+            <w:proofErr w:type="spellStart"/>
+            <w:r>
+              <w:rPr>
+                <w:rFonts w:ascii="Segoe UI Light" w:hAnsi="Segoe UI Light" w:cs="Segoe UI Light"/>
+                <w:b/>
+              </w:rPr>
+              <w:t>partnerPreferred</w:t>
             </w:r>
             <w:proofErr w:type="spellEnd"/>
             <w:r>
@@ -23727,18 +23797,6 @@
             <w:r>
               <w:rPr>
                 <w:rFonts w:ascii="Segoe UI Light" w:hAnsi="Segoe UI Light" w:cs="Segoe UI Light"/>
-              </w:rPr>
-              <w:tab/>
-            </w:r>
-            <w:r>
-              <w:rPr>
-                <w:rFonts w:ascii="Segoe UI Light" w:hAnsi="Segoe UI Light" w:cs="Segoe UI Light"/>
-              </w:rPr>
-              <w:tab/>
-            </w:r>
-            <w:r>
-              <w:rPr>
-                <w:rFonts w:ascii="Segoe UI Light" w:hAnsi="Segoe UI Light" w:cs="Segoe UI Light"/>
                 <w:b/>
               </w:rPr>
               <w:t>{{</w:t>
@@ -23750,6 +23808,22 @@
                 <w:b/>
               </w:rPr>
               <w:t>clientPreferred</w:t>
+            </w:r>
+            <w:proofErr w:type="spellEnd"/>
+            <w:r>
+              <w:rPr>
+                <w:rFonts w:ascii="Segoe UI Light" w:hAnsi="Segoe UI Light" w:cs="Segoe UI Light"/>
+                <w:b/>
+              </w:rPr>
+              <w:t>}} &amp; {{</w:t>
+            </w:r>
+            <w:proofErr w:type="spellStart"/>
+            <w:r>
+              <w:rPr>
+                <w:rFonts w:ascii="Segoe UI Light" w:hAnsi="Segoe UI Light" w:cs="Segoe UI Light"/>
+                <w:b/>
+              </w:rPr>
+              <w:t>partnerPreferred</w:t>
             </w:r>
             <w:proofErr w:type="spellEnd"/>
             <w:r>
@@ -24437,13 +24511,7 @@
         <w:br/>
       </w:r>
     </w:p>
-    <w:p>
-      <w:pPr>
-        <w:rPr>
-          <w:rFonts w:ascii="Segoe UI Light" w:hAnsi="Segoe UI Light" w:cs="Segoe UI Light"/>
-        </w:rPr>
-      </w:pPr>
-    </w:p>
+    <w:p/>
     <w:sectPr>
       <w:headerReference w:type="even" r:id="rId8"/>
       <w:footerReference w:type="even" r:id="rId9"/>

</xml_diff>